<commit_message>
SA 56290: regenerate deploy guide .docx with simplified Matt test
Co-Authored-By: Claude Sonnet 5.5 <noreply@anthropic.com>
</commit_message>
<xml_diff>
--- a/Deploy-Guides/SA-56290-complete-expired-quotes.docx
+++ b/Deploy-Guides/SA-56290-complete-expired-quotes.docx
@@ -299,27 +299,51 @@
       </w:r>
     </w:p>
     <w:p>
-      <w:pPr>
-        <w:ind w:left="504" w:hanging="360"/>
-      </w:pPr>
       <w:r>
-        <w:t>1. Preview and run for a different single day, and check the quotes and the log table.</w:t>
+        <w:t>Run this on Play (P21Play), changing the date to any day that is more than 90 days ago:</w:t>
+      </w:r>
+    </w:p>
+    <w:p>
+      <w:r>
+        <w:rPr>
+          <w:rFonts w:ascii="Consolas" w:hAnsi="Consolas"/>
+          <w:sz w:val="20"/>
+        </w:rPr>
+        <w:t>EXEC dbo.asi_proc_cancel_expired_quotes @DaysAfterExpiration = 90, @Preview = 1, @OnlyExpiredOn = '2026-07-10';</w:t>
       </w:r>
     </w:p>
     <w:p>
       <w:pPr>
-        <w:ind w:left="504" w:hanging="360"/>
+        <w:pStyle w:val="ListBullet"/>
       </w:pPr>
       <w:r>
-        <w:t>2. Reopen one cancelled quote with a new expiration date.</w:t>
+        <w:t>This is a preview only. It lists the quotes that would be cancelled for that one day and changes nothing. Dates that have quotes on Play: 7/10 (1 quote), 7/3 (6 quotes), 7/5 (48 quotes). 7/4 no longer works because it was already used for my test.</w:t>
       </w:r>
     </w:p>
     <w:p>
       <w:pPr>
-        <w:ind w:left="504" w:hanging="360"/>
+        <w:pStyle w:val="ListBullet"/>
       </w:pPr>
       <w:r>
-        <w:t>3. Try an Item Maintenance delete for an item that is only on cancelled quotes.</w:t>
+        <w:t>Check that the quotes listed look like expired, open quotes for that day.</w:t>
+      </w:r>
+    </w:p>
+    <w:p>
+      <w:pPr>
+        <w:pStyle w:val="ListBullet"/>
+      </w:pPr>
+      <w:r>
+        <w:t xml:space="preserve">Optional: to actually cancel them, run the same line with </w:t>
+      </w:r>
+      <w:r>
+        <w:rPr>
+          <w:rFonts w:ascii="Consolas" w:hAnsi="Consolas"/>
+          <w:sz w:val="20"/>
+        </w:rPr>
+        <w:t>@Preview = 0</w:t>
+      </w:r>
+      <w:r>
+        <w:t>. Then reopen one in Order Entry with a new expiration date, and try an Item Maintenance delete for an item that is only on cancelled quotes.</w:t>
       </w:r>
     </w:p>
     <w:p>

</xml_diff>